<commit_message>
Removed Faulty question from database
</commit_message>
<xml_diff>
--- a/backend/templates/template1.docx
+++ b/backend/templates/template1.docx
@@ -1232,6 +1232,7 @@
           <w:p>
             <w:pPr>
               <w:spacing w:after="0" w:line="240" w:lineRule="auto"/>
+              <w:jc w:val="center"/>
               <w:rPr>
                 <w:rFonts w:ascii="Times New Roman" w:hAnsi="Times New Roman"/>
                 <w:sz w:val="24"/>
@@ -1284,6 +1285,7 @@
           <w:p>
             <w:pPr>
               <w:spacing w:after="0" w:line="240" w:lineRule="auto"/>
+              <w:jc w:val="center"/>
               <w:rPr>
                 <w:rFonts w:ascii="Times New Roman" w:hAnsi="Times New Roman"/>
                 <w:b/>
@@ -1338,20 +1340,13 @@
           <w:p>
             <w:pPr>
               <w:spacing w:after="0" w:line="240" w:lineRule="auto"/>
+              <w:jc w:val="center"/>
               <w:rPr>
                 <w:rFonts w:ascii="Times New Roman" w:hAnsi="Times New Roman"/>
                 <w:sz w:val="24"/>
                 <w:szCs w:val="24"/>
               </w:rPr>
             </w:pPr>
-            <w:r>
-              <w:rPr>
-                <w:rFonts w:ascii="Times New Roman" w:hAnsi="Times New Roman"/>
-                <w:sz w:val="24"/>
-                <w:szCs w:val="24"/>
-              </w:rPr>
-              <w:t xml:space="preserve">         </w:t>
-            </w:r>
             <w:r>
               <w:rPr>
                 <w:rFonts w:ascii="Times New Roman" w:hAnsi="Times New Roman"/>

</xml_diff>